<commit_message>
fix(pdf): new docx version, fux LibreOffice trouble
</commit_message>
<xml_diff>
--- a/resources/templates/rental_contract_template.docx
+++ b/resources/templates/rental_contract_template.docx
@@ -17168,6 +17168,79 @@
           <w:highlight w:val="white"/>
         </w:rPr>
       </w:pPr>
+      <w:r>
+        <w:rPr>
+          <w:rFonts w:ascii="Tahoma" w:eastAsia="Tahoma" w:hAnsi="Tahoma" w:cs="Tahoma"/>
+          <w:b/>
+          <w:bCs/>
+          <w:noProof/>
+          <w:sz w:val="16"/>
+          <w:szCs w:val="16"/>
+          <w:highlight w:val="white"/>
+        </w:rPr>
+        <w:drawing>
+          <wp:anchor distT="0" distB="0" distL="114300" distR="114300" simplePos="0" relativeHeight="251700224" behindDoc="0" locked="0" layoutInCell="1" allowOverlap="1" wp14:anchorId="287575F4" wp14:editId="3D3AD347">
+            <wp:simplePos x="0" y="0"/>
+            <wp:positionH relativeFrom="page">
+              <wp:posOffset>-688339</wp:posOffset>
+            </wp:positionH>
+            <wp:positionV relativeFrom="paragraph">
+              <wp:posOffset>508953</wp:posOffset>
+            </wp:positionV>
+            <wp:extent cx="9332418" cy="1720665"/>
+            <wp:effectExtent l="2243772" t="0" r="2436813" b="0"/>
+            <wp:wrapNone/>
+            <wp:docPr id="818902346" name="Рисунок 818902346" descr="C:\Users\Aleksandr.kholin\AppData\Local\Microsoft\Windows\INetCache\Content.MSO\8A1AFAE4.tmp"/>
+            <wp:cNvGraphicFramePr>
+              <a:graphicFrameLocks xmlns:a="http://schemas.openxmlformats.org/drawingml/2006/main" noChangeAspect="1"/>
+            </wp:cNvGraphicFramePr>
+            <a:graphic xmlns:a="http://schemas.openxmlformats.org/drawingml/2006/main">
+              <a:graphicData uri="http://schemas.openxmlformats.org/drawingml/2006/picture">
+                <pic:pic xmlns:pic="http://schemas.openxmlformats.org/drawingml/2006/picture">
+                  <pic:nvPicPr>
+                    <pic:cNvPr id="0" name="Picture 8" descr="C:\Users\Aleksandr.kholin\AppData\Local\Microsoft\Windows\INetCache\Content.MSO\8A1AFAE4.tmp"/>
+                    <pic:cNvPicPr>
+                      <a:picLocks noChangeAspect="1" noChangeArrowheads="1"/>
+                    </pic:cNvPicPr>
+                  </pic:nvPicPr>
+                  <pic:blipFill>
+                    <a:blip r:embed="rId7">
+                      <a:extLst>
+                        <a:ext uri="{28A0092B-C50C-407E-A947-70E740481C1C}">
+                          <a14:useLocalDpi xmlns:a14="http://schemas.microsoft.com/office/drawing/2010/main" val="0"/>
+                        </a:ext>
+                      </a:extLst>
+                    </a:blip>
+                    <a:srcRect/>
+                    <a:stretch>
+                      <a:fillRect/>
+                    </a:stretch>
+                  </pic:blipFill>
+                  <pic:spPr bwMode="auto">
+                    <a:xfrm rot="18590830">
+                      <a:off x="0" y="0"/>
+                      <a:ext cx="9332418" cy="1720665"/>
+                    </a:xfrm>
+                    <a:prstGeom prst="rect">
+                      <a:avLst/>
+                    </a:prstGeom>
+                    <a:noFill/>
+                    <a:ln>
+                      <a:noFill/>
+                    </a:ln>
+                  </pic:spPr>
+                </pic:pic>
+              </a:graphicData>
+            </a:graphic>
+            <wp14:sizeRelH relativeFrom="margin">
+              <wp14:pctWidth>0</wp14:pctWidth>
+            </wp14:sizeRelH>
+            <wp14:sizeRelV relativeFrom="margin">
+              <wp14:pctHeight>0</wp14:pctHeight>
+            </wp14:sizeRelV>
+          </wp:anchor>
+        </w:drawing>
+      </w:r>
     </w:p>
     <w:tbl>
       <w:tblPr>
@@ -17315,79 +17388,6 @@
                 <w:highlight w:val="white"/>
               </w:rPr>
             </w:pPr>
-            <w:r>
-              <w:rPr>
-                <w:rFonts w:ascii="Tahoma" w:eastAsia="Tahoma" w:hAnsi="Tahoma" w:cs="Tahoma"/>
-                <w:b/>
-                <w:bCs/>
-                <w:noProof/>
-                <w:sz w:val="16"/>
-                <w:szCs w:val="16"/>
-                <w:highlight w:val="white"/>
-              </w:rPr>
-              <w:drawing>
-                <wp:anchor distT="0" distB="0" distL="114300" distR="114300" simplePos="0" relativeHeight="251700224" behindDoc="0" locked="0" layoutInCell="1" allowOverlap="1" wp14:anchorId="287575F4" wp14:editId="3D3AD347">
-                  <wp:simplePos x="0" y="0"/>
-                  <wp:positionH relativeFrom="page">
-                    <wp:posOffset>-4642484</wp:posOffset>
-                  </wp:positionH>
-                  <wp:positionV relativeFrom="paragraph">
-                    <wp:posOffset>753745</wp:posOffset>
-                  </wp:positionV>
-                  <wp:extent cx="9332418" cy="1720665"/>
-                  <wp:effectExtent l="2243772" t="0" r="2436813" b="0"/>
-                  <wp:wrapNone/>
-                  <wp:docPr id="818902346" name="Рисунок 818902346" descr="C:\Users\Aleksandr.kholin\AppData\Local\Microsoft\Windows\INetCache\Content.MSO\8A1AFAE4.tmp"/>
-                  <wp:cNvGraphicFramePr>
-                    <a:graphicFrameLocks xmlns:a="http://schemas.openxmlformats.org/drawingml/2006/main" noChangeAspect="1"/>
-                  </wp:cNvGraphicFramePr>
-                  <a:graphic xmlns:a="http://schemas.openxmlformats.org/drawingml/2006/main">
-                    <a:graphicData uri="http://schemas.openxmlformats.org/drawingml/2006/picture">
-                      <pic:pic xmlns:pic="http://schemas.openxmlformats.org/drawingml/2006/picture">
-                        <pic:nvPicPr>
-                          <pic:cNvPr id="0" name="Picture 8" descr="C:\Users\Aleksandr.kholin\AppData\Local\Microsoft\Windows\INetCache\Content.MSO\8A1AFAE4.tmp"/>
-                          <pic:cNvPicPr>
-                            <a:picLocks noChangeAspect="1" noChangeArrowheads="1"/>
-                          </pic:cNvPicPr>
-                        </pic:nvPicPr>
-                        <pic:blipFill>
-                          <a:blip r:embed="rId7">
-                            <a:extLst>
-                              <a:ext uri="{28A0092B-C50C-407E-A947-70E740481C1C}">
-                                <a14:useLocalDpi xmlns:a14="http://schemas.microsoft.com/office/drawing/2010/main" val="0"/>
-                              </a:ext>
-                            </a:extLst>
-                          </a:blip>
-                          <a:srcRect/>
-                          <a:stretch>
-                            <a:fillRect/>
-                          </a:stretch>
-                        </pic:blipFill>
-                        <pic:spPr bwMode="auto">
-                          <a:xfrm rot="18590830">
-                            <a:off x="0" y="0"/>
-                            <a:ext cx="9332418" cy="1720665"/>
-                          </a:xfrm>
-                          <a:prstGeom prst="rect">
-                            <a:avLst/>
-                          </a:prstGeom>
-                          <a:noFill/>
-                          <a:ln>
-                            <a:noFill/>
-                          </a:ln>
-                        </pic:spPr>
-                      </pic:pic>
-                    </a:graphicData>
-                  </a:graphic>
-                  <wp14:sizeRelH relativeFrom="margin">
-                    <wp14:pctWidth>0</wp14:pctWidth>
-                  </wp14:sizeRelH>
-                  <wp14:sizeRelV relativeFrom="margin">
-                    <wp14:pctHeight>0</wp14:pctHeight>
-                  </wp14:sizeRelV>
-                </wp:anchor>
-              </w:drawing>
-            </w:r>
             <w:r>
               <w:rPr>
                 <w:highlight w:val="white"/>

</xml_diff>